<commit_message>
Manuscript and supplemental material
</commit_message>
<xml_diff>
--- a/Assignments, Proposal, and Manuscript/Manuscript/Team10_draft_305_25WT2.docx
+++ b/Assignments, Proposal, and Manuscript/Manuscript/Team10_draft_305_25WT2.docx
@@ -98,7 +98,7 @@
         <w:rPr>
           <w:rFonts w:ascii="Times New Roman" w:hAnsi="Times New Roman" w:cs="Times New Roman"/>
         </w:rPr>
-        <w:pict w14:anchorId="2A87168C">
+        <w:pict w14:anchorId="4FB40609">
           <v:rect id="_x0000_i1025" style="width:0;height:1.5pt" o:hralign="center" o:hrstd="t" o:hr="t" fillcolor="#a0a0a0" stroked="f"/>
         </w:pict>
       </w:r>
@@ -137,7 +137,7 @@
         <w:rPr>
           <w:rFonts w:ascii="Times New Roman" w:eastAsia="Times New Roman" w:hAnsi="Times New Roman" w:cs="Times New Roman"/>
         </w:rPr>
-        <w:t xml:space="preserve">Anemia is a health condition that occurs when the levels of healthy red blood cells (RBCs) or hemoglobin are deficient. This affects oxygen transport throughout the body, resulting in negative cognitive, physiological and </w:t>
+        <w:t xml:space="preserve">Anemia is a health condition characterized by reduced levels of healthy red blood cells (RBCs) or hemoglobin, impairing oxygen transport throughout the body, and leading to negative cognitive, physiological and </w:t>
       </w:r>
       <w:proofErr w:type="spellStart"/>
       <w:r>
@@ -164,27 +164,14 @@
         <w:rPr>
           <w:rFonts w:ascii="Times New Roman" w:eastAsia="Times New Roman" w:hAnsi="Times New Roman" w:cs="Times New Roman"/>
         </w:rPr>
-        <w:t>) and multiple micronutrient powders (MNP), is a common treatment for anemia by replenishing iron stores and normalizing hemoglobin levels. However, there is limited information on how FeSO</w:t>
-      </w:r>
-      <w:r>
-        <w:rPr>
-          <w:rFonts w:ascii="Times New Roman" w:eastAsia="Times New Roman" w:hAnsi="Times New Roman" w:cs="Times New Roman"/>
-          <w:vertAlign w:val="subscript"/>
-        </w:rPr>
-        <w:t>4</w:t>
-      </w:r>
-      <w:r>
-        <w:rPr>
-          <w:rFonts w:ascii="Times New Roman" w:eastAsia="Times New Roman" w:hAnsi="Times New Roman" w:cs="Times New Roman"/>
-        </w:rPr>
-        <w:t xml:space="preserve"> and MNP affect microbial composition in comparison to each other. In this study, we analyzed the influence of different </w:t>
+        <w:t xml:space="preserve">) and multiple micronutrient powders (MNP), is a common treatment for anemia by replenishing iron stores and normalizing hemoglobin levels. However, the comparative effects of these supplementation strategies on gut microbiome composition remain unclear. In this study, we analyzed the impacts of different iron </w:t>
       </w:r>
       <w:r>
         <w:rPr>
           <w:rFonts w:ascii="Times New Roman" w:eastAsia="Times New Roman" w:hAnsi="Times New Roman" w:cs="Times New Roman"/>
         </w:rPr>
         <w:lastRenderedPageBreak/>
-        <w:t xml:space="preserve">iron supplementation types on gut microbiome composition and the effects of these microbial differences on hemoglobin and ferritin levels in 12-month-old anemic infants. We hypothesized that iron supplementation would lead to measurable shifts in both the composition and functional potential of the infant gut microbiome. We used 16S rRNA sequencing data to compare diversity metrics, differential abundance, predictive functional analyses, and linear regression. We found no significant differences in gut microbiome composition among 12-month-old anemic infants receiving different supplementation types. In addition, iron supplementation was found to be beneficial as increased hemoglobin and ferritin levels are associated with gut microbial diversity. Our study provided valuable insights into the effects of iron supplementation on the gut </w:t>
+        <w:t xml:space="preserve">supplementation types on gut microbiome composition and examined the associations between microbiome composition and hemoglobin and ferritin levels in 12-month-old anemic infants. We hypothesized that iron supplementation would result in measurable shifts in both the composition and functional potential of the infant gut microbiome. Using 16S rRNA sequencing data, we assessed alpha and beta diversity, differential abundance, predictive functional analyses, and associations with hemoglobin and ferritin levels via linear regression. We found no significant differences in gut microbiome composition or predicted function, among 12-month-old anemic infants receiving different supplementation types. In addition, iron supplementation was found to be beneficial as increased hemoglobin and ferritin levels are associated with gut microbial diversity. Our study provides valuable insights into the effects of iron supplementation on the gut </w:t>
       </w:r>
       <w:proofErr w:type="gramStart"/>
       <w:r>
@@ -206,6 +193,7 @@
         <w:spacing w:before="120" w:after="120" w:line="480" w:lineRule="auto"/>
         <w:rPr>
           <w:rFonts w:ascii="Times New Roman" w:eastAsia="Times New Roman" w:hAnsi="Times New Roman" w:cs="Times New Roman"/>
+          <w:highlight w:val="yellow"/>
         </w:rPr>
       </w:pPr>
     </w:p>
@@ -257,7 +245,27 @@
           <w:sz w:val="22"/>
           <w:szCs w:val="22"/>
         </w:rPr>
-        <w:t xml:space="preserve">Anemia is a health condition that occurs when there is a deficiency of healthy red blood cells or hemoglobin. Red blood cells (RBCs) transport oxygen from the lungs to tissues throughout the body, while hemoglobin is an iron-rich protein within RBCs that binds to oxygen and enables its transport through the bloodstream </w:t>
+        <w:t xml:space="preserve">Anemia is a health condition characterized by a deficiency of deficiency of healthy red blood cells (RBCs) or hemoglobin. RBCs are responsible for transporting oxygen from the lungs to tissues throughout the body, while hemoglobin, an iron-rich protein within RBCs, facilitates oxygen binding and </w:t>
+      </w:r>
+      <w:proofErr w:type="spellStart"/>
+      <w:r>
+        <w:rPr>
+          <w:rFonts w:ascii="Times New Roman" w:eastAsia="Times New Roman" w:hAnsi="Times New Roman" w:cs="Times New Roman"/>
+          <w:color w:val="000000"/>
+          <w:sz w:val="22"/>
+          <w:szCs w:val="22"/>
+        </w:rPr>
+        <w:t>and</w:t>
+      </w:r>
+      <w:proofErr w:type="spellEnd"/>
+      <w:r>
+        <w:rPr>
+          <w:rFonts w:ascii="Times New Roman" w:eastAsia="Times New Roman" w:hAnsi="Times New Roman" w:cs="Times New Roman"/>
+          <w:color w:val="000000"/>
+          <w:sz w:val="22"/>
+          <w:szCs w:val="22"/>
+        </w:rPr>
+        <w:t xml:space="preserve"> enables its transport through the bloodstream </w:t>
       </w:r>
       <w:hyperlink r:id="rId6">
         <w:r>
@@ -332,7 +340,7 @@
         <w:rPr>
           <w:rFonts w:ascii="Times New Roman" w:eastAsia="Times New Roman" w:hAnsi="Times New Roman" w:cs="Times New Roman"/>
         </w:rPr>
-        <w:t xml:space="preserve">Anemia can occur due to various reasons, including low birth weight or vitamin deficiency, but iron-deficiency anemia (IDA) is the most common form </w:t>
+        <w:t xml:space="preserve">Anemia can arise due to various reasons, including low birth weight or vitamin deficiency, but iron-deficiency anemia (IDA) is the most common form </w:t>
       </w:r>
       <w:hyperlink r:id="rId9">
         <w:r>
@@ -346,7 +354,14 @@
         <w:rPr>
           <w:rFonts w:ascii="Times New Roman" w:eastAsia="Times New Roman" w:hAnsi="Times New Roman" w:cs="Times New Roman"/>
         </w:rPr>
-        <w:t xml:space="preserve">. Infants are especially vulnerable to anemia because of their rapid growth and increased nutritional requirements during early development. Iron deficiency is therefore a major contributor to anemia during infancy because iron is an essential nutrient for hemoglobin production and the formation of red blood cells </w:t>
+        <w:t xml:space="preserve">. Infants are especially vulnerable to anemia because of their rapid growth and increased nutritional requirements during early development. Iron </w:t>
+      </w:r>
+      <w:r>
+        <w:rPr>
+          <w:rFonts w:ascii="Times New Roman" w:eastAsia="Times New Roman" w:hAnsi="Times New Roman" w:cs="Times New Roman"/>
+        </w:rPr>
+        <w:lastRenderedPageBreak/>
+        <w:t xml:space="preserve">deficiency is therefore a major contributor to anemia during infancy because iron is an essential nutrient for hemoglobin production and the formation of red blood cells </w:t>
       </w:r>
       <w:hyperlink r:id="rId10">
         <w:r>
@@ -354,6 +369,20 @@
             <w:rFonts w:ascii="Times New Roman" w:eastAsia="Times New Roman" w:hAnsi="Times New Roman" w:cs="Times New Roman"/>
           </w:rPr>
           <w:t>(5)</w:t>
+        </w:r>
+      </w:hyperlink>
+      <w:r>
+        <w:rPr>
+          <w:rFonts w:ascii="Times New Roman" w:eastAsia="Times New Roman" w:hAnsi="Times New Roman" w:cs="Times New Roman"/>
+        </w:rPr>
+        <w:t xml:space="preserve">.  If left untreated, anemic children may develop mental or motor development issues </w:t>
+      </w:r>
+      <w:hyperlink r:id="rId11">
+        <w:r>
+          <w:rPr>
+            <w:rFonts w:ascii="Times New Roman" w:eastAsia="Times New Roman" w:hAnsi="Times New Roman" w:cs="Times New Roman"/>
+          </w:rPr>
+          <w:t>(2)</w:t>
         </w:r>
       </w:hyperlink>
       <w:r>
@@ -375,22 +404,7 @@
         <w:rPr>
           <w:rFonts w:ascii="Times New Roman" w:eastAsia="Times New Roman" w:hAnsi="Times New Roman" w:cs="Times New Roman"/>
         </w:rPr>
-        <w:lastRenderedPageBreak/>
-        <w:t xml:space="preserve">If left untreated, anemic children may develop mental or motor development issues </w:t>
-      </w:r>
-      <w:hyperlink r:id="rId11">
-        <w:r>
-          <w:rPr>
-            <w:rFonts w:ascii="Times New Roman" w:eastAsia="Times New Roman" w:hAnsi="Times New Roman" w:cs="Times New Roman"/>
-          </w:rPr>
-          <w:t>(2)</w:t>
-        </w:r>
-      </w:hyperlink>
-      <w:r>
-        <w:rPr>
-          <w:rFonts w:ascii="Times New Roman" w:eastAsia="Times New Roman" w:hAnsi="Times New Roman" w:cs="Times New Roman"/>
-        </w:rPr>
-        <w:t>. Consequently, supplements such as ferrous sulphate (</w:t>
+        <w:t>To address iron deficiency, supplements strategies such as ferrous sulphate (</w:t>
       </w:r>
       <w:proofErr w:type="spellStart"/>
       <w:r>
@@ -404,7 +418,7 @@
         <w:rPr>
           <w:rFonts w:ascii="Times New Roman" w:eastAsia="Times New Roman" w:hAnsi="Times New Roman" w:cs="Times New Roman"/>
         </w:rPr>
-        <w:t xml:space="preserve">₄) or micronutrient powders (MNPs) are often recommended to infants to help increase iron levels </w:t>
+        <w:t xml:space="preserve">₄) or micronutrient powders (MNPs) are commonly used </w:t>
       </w:r>
       <w:hyperlink r:id="rId12">
         <w:r>
@@ -531,7 +545,7 @@
         <w:rPr>
           <w:rFonts w:ascii="Times New Roman" w:eastAsia="Times New Roman" w:hAnsi="Times New Roman" w:cs="Times New Roman"/>
         </w:rPr>
-        <w:t xml:space="preserve">₄ are common types of supplements used to treat anemic patients, their effect on microbial composition relative to each other is not known. Furthermore, although many studies were previously done to observe the change in ferritin and hemoglobin levels after using </w:t>
+        <w:t xml:space="preserve">₄ are common types of supplements used to treat anemic patients, their comparative effects on gut microbiome composition remain unclear. Furthermore, although many studies were previously done to observe the change in ferritin and hemoglobin levels after using </w:t>
       </w:r>
       <w:proofErr w:type="spellStart"/>
       <w:r>
@@ -645,7 +659,7 @@
         <w:rPr>
           <w:rFonts w:ascii="Times New Roman" w:eastAsia="Times New Roman" w:hAnsi="Times New Roman" w:cs="Times New Roman"/>
         </w:rPr>
-        <w:t xml:space="preserve">₄ vs. none) influences gut microbiome composition and how these microbial differences relate to hemoglobin and ferritin levels in 12-month-old breastfed infants </w:t>
+        <w:t xml:space="preserve">₄ vs. none) influences gut microbiome composition and how these microbial differences relate to hemoglobin and ferritin levels in 12-month-old anemic infants </w:t>
       </w:r>
       <w:hyperlink r:id="rId17">
         <w:r>
@@ -701,14 +715,20 @@
         <w:rPr>
           <w:rFonts w:ascii="Times New Roman" w:eastAsia="Times New Roman" w:hAnsi="Times New Roman" w:cs="Times New Roman"/>
         </w:rPr>
-        <w:t xml:space="preserve">₄, or no supplements, and venous blood samples were collected from each infant to measure hemoglobin ferritin levels. Using this data, </w:t>
+        <w:t xml:space="preserve">₄, or no supplements, and venous </w:t>
+      </w:r>
+      <w:r>
+        <w:rPr>
+          <w:rFonts w:ascii="Times New Roman" w:eastAsia="Times New Roman" w:hAnsi="Times New Roman" w:cs="Times New Roman"/>
+        </w:rPr>
+        <w:lastRenderedPageBreak/>
+        <w:t xml:space="preserve">blood samples were collected from each infant to measure hemoglobin ferritin levels. Using this data, </w:t>
       </w:r>
       <w:proofErr w:type="spellStart"/>
       <w:r>
         <w:rPr>
           <w:rFonts w:ascii="Times New Roman" w:eastAsia="Times New Roman" w:hAnsi="Times New Roman" w:cs="Times New Roman"/>
         </w:rPr>
-        <w:lastRenderedPageBreak/>
         <w:t>McClorry</w:t>
       </w:r>
       <w:proofErr w:type="spellEnd"/>
@@ -745,7 +765,21 @@
         <w:rPr>
           <w:rFonts w:ascii="Times New Roman" w:eastAsia="Times New Roman" w:hAnsi="Times New Roman" w:cs="Times New Roman"/>
         </w:rPr>
-        <w:t xml:space="preserve">Hemoglobin and ferritin levels for each sample were then measured using these blood samples. Since measuring RBC for anemia diagnosis requires complex analysis, only hemoglobin concentrations were used to determine if an infant was anemic. If an infant had a hemoglobin concentration of &lt;110 g/L, they were considered anemic. Samples for 6-month-old infants were also included, but this study only focuses on the 12-month-old infants for our studies since the microbiome changes quickly in early life development. This study focused on hemoglobin and ferritin levels, which are blood biomarkers used to assess iron status. Hemoglobin measures the concentration of the oxygen-carrying protein in RBCs and is used to identify anemia, while ferritin measures the amount of iron in the body </w:t>
+        <w:t xml:space="preserve">Hemoglobin and ferritin levels for each sample were then measured using these blood samples. Since measuring RBC for anemia diagnosis requires complex analysis, only hemoglobin concentrations were used to determine if an infant was anemic. If an infant had a hemoglobin concentration of &lt;110 g/L, they were considered anemic. Samples for 6-month-old infants were also included, but this study only focuses on the 12-month-old infants for our studies since the microbiome changes quickly in early life development. Therefore, the dataset was filtered to include only 12-month-old anemic infants, resulting in a subset of 58 samples used for downstream analyses. This filtered dataset included 15 infants in the </w:t>
+      </w:r>
+      <w:proofErr w:type="spellStart"/>
+      <w:r>
+        <w:rPr>
+          <w:rFonts w:ascii="Times New Roman" w:eastAsia="Times New Roman" w:hAnsi="Times New Roman" w:cs="Times New Roman"/>
+        </w:rPr>
+        <w:t>FeSO</w:t>
+      </w:r>
+      <w:proofErr w:type="spellEnd"/>
+      <w:r>
+        <w:rPr>
+          <w:rFonts w:ascii="Times New Roman" w:eastAsia="Times New Roman" w:hAnsi="Times New Roman" w:cs="Times New Roman"/>
+        </w:rPr>
+        <w:t xml:space="preserve">₄ group, 32 in the MNP group, and 11 in the non-supplemented group.  This study focused on hemoglobin and ferritin levels, which are blood biomarkers used to assess iron status. Hemoglobin measures the concentration of the oxygen-carrying protein in RBCs and is used to identify anemia, while ferritin measures the amount of iron in the body </w:t>
       </w:r>
       <w:hyperlink r:id="rId20">
         <w:r>
@@ -889,6 +923,7 @@
           <w:bCs/>
           <w:color w:val="000000"/>
         </w:rPr>
+        <w:lastRenderedPageBreak/>
         <w:t>Methods and Materials</w:t>
       </w:r>
     </w:p>
@@ -971,14 +1006,7 @@
         <w:rPr>
           <w:rFonts w:ascii="Times New Roman" w:eastAsia="Times New Roman" w:hAnsi="Times New Roman" w:cs="Times New Roman"/>
         </w:rPr>
-        <w:t xml:space="preserve">. </w:t>
-      </w:r>
-      <w:r>
-        <w:rPr>
-          <w:rFonts w:ascii="Times New Roman" w:eastAsia="Times New Roman" w:hAnsi="Times New Roman" w:cs="Times New Roman"/>
-        </w:rPr>
-        <w:lastRenderedPageBreak/>
-        <w:t xml:space="preserve">Multiplexed sequences were then obtained using the Illumina </w:t>
+        <w:t xml:space="preserve">. Multiplexed sequences were then obtained using the Illumina </w:t>
       </w:r>
       <w:proofErr w:type="spellStart"/>
       <w:r>
@@ -1176,7 +1204,14 @@
         <w:rPr>
           <w:rFonts w:ascii="Times New Roman" w:eastAsia="Times New Roman" w:hAnsi="Times New Roman" w:cs="Times New Roman"/>
         </w:rPr>
-        <w:t xml:space="preserve">, MNP, and no supplement treatment groups respectively. Lastly, a </w:t>
+        <w:t xml:space="preserve">, MNP, and </w:t>
+      </w:r>
+      <w:r>
+        <w:rPr>
+          <w:rFonts w:ascii="Times New Roman" w:eastAsia="Times New Roman" w:hAnsi="Times New Roman" w:cs="Times New Roman"/>
+        </w:rPr>
+        <w:lastRenderedPageBreak/>
+        <w:t xml:space="preserve">no supplement treatment groups respectively. Lastly, a </w:t>
       </w:r>
       <w:proofErr w:type="spellStart"/>
       <w:r>
@@ -1262,14 +1297,7 @@
         <w:rPr>
           <w:rFonts w:ascii="Times New Roman" w:eastAsia="Times New Roman" w:hAnsi="Times New Roman" w:cs="Times New Roman"/>
         </w:rPr>
-        <w:t xml:space="preserve"> (v1.54.0), vegan (2.7-2), microbiome (v1.3), </w:t>
-      </w:r>
-      <w:r>
-        <w:rPr>
-          <w:rFonts w:ascii="Times New Roman" w:eastAsia="Times New Roman" w:hAnsi="Times New Roman" w:cs="Times New Roman"/>
-        </w:rPr>
-        <w:lastRenderedPageBreak/>
-        <w:t xml:space="preserve">ggplot2 (v4.0.2), and </w:t>
+        <w:t xml:space="preserve"> (v1.54.0), vegan (2.7-2), microbiome (v1.3), ggplot2 (v4.0.2), and </w:t>
       </w:r>
       <w:proofErr w:type="spellStart"/>
       <w:r>
@@ -1589,6 +1617,7 @@
           <w:b/>
           <w:bCs/>
         </w:rPr>
+        <w:lastRenderedPageBreak/>
         <w:t>Differential Abundance Analysis.</w:t>
       </w:r>
       <w:r>
@@ -1791,7 +1820,14 @@
         <w:rPr>
           <w:rFonts w:ascii="Times New Roman" w:eastAsia="Times New Roman" w:hAnsi="Times New Roman" w:cs="Times New Roman"/>
         </w:rPr>
-        <w:t xml:space="preserve">₄) and non-supplemented groups (None). These correlations were visualized on scatter plots with regression lines. For all these regression analyses, p-values lower than 0.05 were used to indicate statistically significant correlations. These regression analyses were performed with R (v4.5.2) using the </w:t>
+        <w:t xml:space="preserve">₄) and non-supplemented groups (None). These correlations were visualized on scatter plots with regression lines. For all these regression analyses, p-values lower than 0.05 were used to indicate statistically significant correlations. These regression </w:t>
+      </w:r>
+      <w:r>
+        <w:rPr>
+          <w:rFonts w:ascii="Times New Roman" w:eastAsia="Times New Roman" w:hAnsi="Times New Roman" w:cs="Times New Roman"/>
+        </w:rPr>
+        <w:lastRenderedPageBreak/>
+        <w:t xml:space="preserve">analyses were performed with R (v4.5.2) using the </w:t>
       </w:r>
       <w:proofErr w:type="spellStart"/>
       <w:r>
@@ -1864,7 +1900,6 @@
           <w:bCs/>
           <w:color w:val="000000"/>
         </w:rPr>
-        <w:lastRenderedPageBreak/>
         <w:t>Results</w:t>
       </w:r>
     </w:p>
@@ -2071,7 +2106,14 @@
         <w:rPr>
           <w:rFonts w:ascii="Times New Roman" w:eastAsia="Gungsuh" w:hAnsi="Times New Roman" w:cs="Times New Roman"/>
         </w:rPr>
-        <w:t xml:space="preserve"> treatment group to the control (Figure 2A) it was found that no taxa had passed the q ≤ 0.05 significance cut-off, as none of the data points were able to pass the threshold of 1.3. Additionally, the fold changes between the two groups were minimal, as most of the points clustered around 0 on the x-axis while the relative range seemed to be -0.15 - 0.1. A similar trend was seen when comparing MNP to the control group (Figure 2B), as most of the points had a fold change close to 0. For the statistical significance, </w:t>
+        <w:t xml:space="preserve"> treatment group to the control (Figure 2A) it was found that no taxa had passed the q ≤ 0.05 significance cut-off, as none of the data points were able to pass the threshold of 1.3. Additionally, the fold changes between the two groups were minimal, as most of the points clustered around 0 on the x-axis while the relative range seemed to be -0.15 - 0.1. A similar </w:t>
+      </w:r>
+      <w:r>
+        <w:rPr>
+          <w:rFonts w:ascii="Times New Roman" w:eastAsia="Gungsuh" w:hAnsi="Times New Roman" w:cs="Times New Roman"/>
+        </w:rPr>
+        <w:lastRenderedPageBreak/>
+        <w:t xml:space="preserve">trend was seen when comparing MNP to the control group (Figure 2B), as most of the points had a fold change close to 0. For the statistical significance, </w:t>
       </w:r>
       <w:proofErr w:type="gramStart"/>
       <w:r>
@@ -2099,14 +2141,7 @@
         <w:rPr>
           <w:rFonts w:ascii="Times New Roman" w:eastAsia="Gungsuh" w:hAnsi="Times New Roman" w:cs="Times New Roman"/>
         </w:rPr>
-        <w:t xml:space="preserve"> ultimately does </w:t>
-      </w:r>
-      <w:r>
-        <w:rPr>
-          <w:rFonts w:ascii="Times New Roman" w:eastAsia="Gungsuh" w:hAnsi="Times New Roman" w:cs="Times New Roman"/>
-        </w:rPr>
-        <w:lastRenderedPageBreak/>
-        <w:t>not pass it. Overall, these results communicate that the FeSO</w:t>
+        <w:t xml:space="preserve"> ultimately does not pass it. Overall, these results communicate that the FeSO</w:t>
       </w:r>
       <w:r>
         <w:rPr>
@@ -2264,7 +2299,15 @@
           <w:rFonts w:ascii="Times New Roman" w:eastAsia="Times New Roman" w:hAnsi="Times New Roman" w:cs="Times New Roman"/>
           <w:highlight w:val="white"/>
         </w:rPr>
-        <w:t xml:space="preserve">. Furthermore, the rho values for these correlations are 0.386 for hemoglobin and 0.396 for ferritin, thus indicating a weak positive correlation between microbial diversity and the iron biomarkers. Therefore, higher hemoglobin or ferritin levels are associated with greater microbial diversity. </w:t>
+        <w:t xml:space="preserve">. Furthermore, the rho values for these correlations are 0.386 for hemoglobin and 0.396 for ferritin, thus indicating a weak positive correlation between microbial diversity </w:t>
+      </w:r>
+      <w:r>
+        <w:rPr>
+          <w:rFonts w:ascii="Times New Roman" w:eastAsia="Times New Roman" w:hAnsi="Times New Roman" w:cs="Times New Roman"/>
+          <w:highlight w:val="white"/>
+        </w:rPr>
+        <w:lastRenderedPageBreak/>
+        <w:t xml:space="preserve">and the iron biomarkers. Therefore, higher hemoglobin or ferritin levels are associated with greater microbial diversity. </w:t>
       </w:r>
     </w:p>
     <w:p>
@@ -2293,7 +2336,6 @@
           <w:b/>
           <w:bCs/>
         </w:rPr>
-        <w:lastRenderedPageBreak/>
         <w:t xml:space="preserve">No significant correlation was found between the microbiome diversity and hemoglobin or ferritin levels between supplementation types when compared to non-supplemented infants. </w:t>
       </w:r>
       <w:r>
@@ -2512,14 +2554,8 @@
         <w:rPr>
           <w:rFonts w:ascii="Times New Roman" w:eastAsia="Times New Roman" w:hAnsi="Times New Roman" w:cs="Times New Roman"/>
         </w:rPr>
-        <w:t xml:space="preserve">These findings suggest that iron supplementation is not associated with large-scale differences in microbial richness, evenness, or overall community structure in 12-month-old anemic infants. During this stage of infancy, the gut microbiome is undergoing rapid development, and it may be possible that microbial communities are more variable or resilient to external disruptions, including dietary </w:t>
-      </w:r>
-      <w:r>
-        <w:rPr>
-          <w:rFonts w:ascii="Times New Roman" w:eastAsia="Times New Roman" w:hAnsi="Times New Roman" w:cs="Times New Roman"/>
-        </w:rPr>
         <w:lastRenderedPageBreak/>
-        <w:t xml:space="preserve">supplementation </w:t>
+        <w:t xml:space="preserve">These findings suggest that iron supplementation is not associated with large-scale differences in microbial richness, evenness, or overall community structure in 12-month-old anemic infants. During this stage of infancy, the gut microbiome is undergoing rapid development, and it may be possible that microbial communities are more variable or resilient to external disruptions, including dietary supplementation </w:t>
       </w:r>
       <w:hyperlink r:id="rId54">
         <w:r>
@@ -2533,19 +2569,7 @@
         <w:rPr>
           <w:rFonts w:ascii="Times New Roman" w:eastAsia="Times New Roman" w:hAnsi="Times New Roman" w:cs="Times New Roman"/>
         </w:rPr>
-        <w:t xml:space="preserve">. For this </w:t>
-      </w:r>
-      <w:r>
-        <w:rPr>
-          <w:rFonts w:ascii="Times New Roman" w:eastAsia="Times New Roman" w:hAnsi="Times New Roman" w:cs="Times New Roman"/>
-        </w:rPr>
-        <w:t>reason,</w:t>
-      </w:r>
-      <w:r>
-        <w:rPr>
-          <w:rFonts w:ascii="Times New Roman" w:eastAsia="Times New Roman" w:hAnsi="Times New Roman" w:cs="Times New Roman"/>
-        </w:rPr>
-        <w:t xml:space="preserve"> we may observe potential microbiome responses to iron with subtle changes at the taxa or microbial function level rather than manifesting as broad shifts in diversity.</w:t>
+        <w:t>. For this reason, microbiome responses to iron supplementation may occur with subtle changes at the taxa or microbial function level rather than manifesting as broad shifts in diversity.</w:t>
       </w:r>
     </w:p>
     <w:p>
@@ -2591,12 +2615,14 @@
         </w:rPr>
         <w:t xml:space="preserve">When analyzing the indicator species for each of the supplement groups, it was found that 5 of the genera were present in </w:t>
       </w:r>
-      <w:r>
-        <w:rPr>
-          <w:rFonts w:ascii="Times New Roman" w:eastAsia="Times New Roman" w:hAnsi="Times New Roman" w:cs="Times New Roman"/>
-        </w:rPr>
-        <w:t>all</w:t>
-      </w:r>
+      <w:proofErr w:type="gramStart"/>
+      <w:r>
+        <w:rPr>
+          <w:rFonts w:ascii="Times New Roman" w:eastAsia="Times New Roman" w:hAnsi="Times New Roman" w:cs="Times New Roman"/>
+        </w:rPr>
+        <w:t>all of</w:t>
+      </w:r>
+      <w:proofErr w:type="gramEnd"/>
       <w:r>
         <w:rPr>
           <w:rFonts w:ascii="Times New Roman" w:eastAsia="Times New Roman" w:hAnsi="Times New Roman" w:cs="Times New Roman"/>
@@ -2685,7 +2711,14 @@
         <w:rPr>
           <w:rFonts w:ascii="Times New Roman" w:eastAsia="Gungsuh" w:hAnsi="Times New Roman" w:cs="Times New Roman"/>
         </w:rPr>
-        <w:t xml:space="preserve"> (Figure 2A) and MNP (Figure 2B) treatment groups, it was found that no taxa had passed the q ≤ 0.05 significance cut-off, and the fold changes relative to the control were minimal and mostly clustered around 0 on the x-axis. These graphs serve to communicate that each of the taxa had a relatively consistent abundance regardless of the presence of iron supplementation, suggesting that iron supplementation does not strongly affect the microbiome composition in infants. Overall, the results from our indicator species and differential abundance analysis suggest that iron supplementation alone is not sufficient to restructure the microbial composition of the gut in anemic infants.  These findings reject our original hypothesis which theorized that there would be a measurable difference in the microbiome of the supplemented treatment groups compared to the control. </w:t>
+        <w:t xml:space="preserve"> (Figure 2A) and MNP (Figure 2B) treatment groups, it was found that no taxa had passed the q ≤ 0.05 significance cut-off, and the fold changes relative to the control were minimal and mostly clustered around 0 on the x-axis. These graphs serve to communicate that each of the taxa had a relatively consistent abundance regardless of the presence of iron supplementation, suggesting that iron supplementation does not strongly affect the microbiome composition in infants. Overall, the results from our indicator species and differential abundance analysis suggest that iron supplementation alone is not sufficient to restructure the microbial composition of the </w:t>
+      </w:r>
+      <w:r>
+        <w:rPr>
+          <w:rFonts w:ascii="Times New Roman" w:eastAsia="Gungsuh" w:hAnsi="Times New Roman" w:cs="Times New Roman"/>
+        </w:rPr>
+        <w:lastRenderedPageBreak/>
+        <w:t xml:space="preserve">gut in anemic infants.  These findings reject our original hypothesis which theorized that there would be a measurable difference in the microbiome of the supplemented treatment groups compared to the control. </w:t>
       </w:r>
     </w:p>
     <w:p>
@@ -2700,14 +2733,7 @@
         <w:rPr>
           <w:rFonts w:ascii="Times New Roman" w:eastAsia="Times New Roman" w:hAnsi="Times New Roman" w:cs="Times New Roman"/>
         </w:rPr>
-        <w:t xml:space="preserve">The indicator species and differential abundance analyses results seem to be inconsistent with previous findings, such as one by Tang et al. which found that MNP supplementation with iron can affect </w:t>
-      </w:r>
-      <w:r>
-        <w:rPr>
-          <w:rFonts w:ascii="Times New Roman" w:eastAsia="Times New Roman" w:hAnsi="Times New Roman" w:cs="Times New Roman"/>
-        </w:rPr>
-        <w:lastRenderedPageBreak/>
-        <w:t xml:space="preserve">the microbial composition of the gut through decreasing </w:t>
+        <w:t xml:space="preserve">The indicator species and differential abundance analyses results seem to be inconsistent with previous findings, such as one by Tang et al. which found that MNP supplementation with iron can affect the microbial composition of the gut through decreasing </w:t>
       </w:r>
       <w:r>
         <w:rPr>
@@ -2842,7 +2868,7 @@
         <w:rPr>
           <w:rFonts w:ascii="Times New Roman" w:eastAsia="Times New Roman" w:hAnsi="Times New Roman" w:cs="Times New Roman"/>
         </w:rPr>
-        <w:t xml:space="preserve"> provide a stronger argument for the study. We originally hypothesized that the gut microbiome of individuals who took iron supplements would exhibit measurably different functional capabilities. Visualization of our PCIRUSt2 functional analysis results revealed no substantial alterations of the functional capabilities between MNP and FeSO</w:t>
+        <w:t xml:space="preserve"> provide a stronger argument for the study. We originally hypothesized that the gut microbiome of individuals who took iron supplements would exhibit measurably different functional capabilities. Visualization of our PICRUSt2 functional analysis results revealed no substantial alterations of the functional capabilities between MNP and FeSO</w:t>
       </w:r>
       <w:r>
         <w:rPr>
@@ -2939,6 +2965,7 @@
         <w:rPr>
           <w:rFonts w:ascii="Times New Roman" w:eastAsia="Times New Roman" w:hAnsi="Times New Roman" w:cs="Times New Roman"/>
         </w:rPr>
+        <w:lastRenderedPageBreak/>
         <w:t xml:space="preserve">Limited research has been done </w:t>
       </w:r>
       <w:proofErr w:type="gramStart"/>
@@ -2981,14 +3008,7 @@
         <w:rPr>
           <w:rFonts w:ascii="Times New Roman" w:eastAsia="Times New Roman" w:hAnsi="Times New Roman" w:cs="Times New Roman"/>
         </w:rPr>
-        <w:t xml:space="preserve">. The consistency across our studies supports the </w:t>
-      </w:r>
-      <w:r>
-        <w:rPr>
-          <w:rFonts w:ascii="Times New Roman" w:eastAsia="Times New Roman" w:hAnsi="Times New Roman" w:cs="Times New Roman"/>
-        </w:rPr>
-        <w:lastRenderedPageBreak/>
-        <w:t>broader implication that the composition, and therefore function of the infant gut microbiome may be less sensitive to iron supplementation.</w:t>
+        <w:t>. The consistency across our studies supports the broader implication that the composition, and therefore function of the infant gut microbiome may be less sensitive to iron supplementation.</w:t>
       </w:r>
     </w:p>
     <w:p>
@@ -3017,7 +3037,7 @@
         <w:rPr>
           <w:rFonts w:ascii="Times New Roman" w:eastAsia="Times New Roman" w:hAnsi="Times New Roman" w:cs="Times New Roman"/>
         </w:rPr>
-        <w:t xml:space="preserve">. This result suggests that increasing hemoglobin or ferritin levels may help increase microbial diversity in infants. However, although these positive correlations are statistically significant, the low rho value indicates that the correlation is weak as observed by the large residuals in Figure 4 between the data points and the regression lines. Therefore, there are likely other factors such as sex differences that are influencing the correlation between microbiome diversity and iron biomarkers because previous studies have found that there are metabolic pathway differences associated with anemia between sexes, possibly contributing to the large residuals in Figure 4 </w:t>
+        <w:t xml:space="preserve">. This result suggests that higher hemoglobin or ferritin levels are associated with increased microbial diversity in infants. However, although these positive correlations are statistically significant, the low rho value indicates that the correlation is weak as observed by the large residuals in Figure 4 between the data points and the regression lines. Therefore, there are likely other factors such as sex differences that are influencing the correlation between microbiome diversity and iron biomarkers because previous studies have found that there are metabolic pathway differences associated with anemia between sexes, possibly contributing to the large residuals in Figure 4 </w:t>
       </w:r>
       <w:hyperlink r:id="rId61">
         <w:r>
@@ -3091,7 +3111,14 @@
         <w:rPr>
           <w:rFonts w:ascii="Times New Roman" w:eastAsia="Times New Roman" w:hAnsi="Times New Roman" w:cs="Times New Roman"/>
         </w:rPr>
-        <w:t xml:space="preserve"> When interpreting these findings, there are several limitations that should be considered. First, this study did not account for the presence of infections or parasitic conditions among the infants, as approximately a third of the anemic infants in our dataset were reported to have ongoing infections and/or gastrointestinal parasites. Although the specific infections were not recorded, prior studies have revealed that infection can be associated with decreased microbial composition and diversity as well as increased ferritin and other host biomarkers such as ferritin due to inflammation </w:t>
+        <w:t xml:space="preserve"> When interpreting these findings, there are several limitations that should be considered. First, this study did not account for the presence of infections or parasitic conditions among the infants, as approximately a third of the anemic infants in our dataset were reported to have ongoing </w:t>
+      </w:r>
+      <w:r>
+        <w:rPr>
+          <w:rFonts w:ascii="Times New Roman" w:eastAsia="Times New Roman" w:hAnsi="Times New Roman" w:cs="Times New Roman"/>
+        </w:rPr>
+        <w:lastRenderedPageBreak/>
+        <w:t xml:space="preserve">infections and/or gastrointestinal parasites. Although the specific infections were not recorded, prior studies have revealed that infection can be associated with decreased microbial composition and diversity as well as increased ferritin and other host biomarkers such as ferritin due to inflammation </w:t>
       </w:r>
       <w:hyperlink r:id="rId63">
         <w:r>
@@ -3105,14 +3132,7 @@
         <w:rPr>
           <w:rFonts w:ascii="Times New Roman" w:eastAsia="Times New Roman" w:hAnsi="Times New Roman" w:cs="Times New Roman"/>
         </w:rPr>
-        <w:t xml:space="preserve">. Especially gastrointestinal parasites, which have been linked to microbial dysbiosis and shifts in </w:t>
-      </w:r>
-      <w:r>
-        <w:rPr>
-          <w:rFonts w:ascii="Times New Roman" w:eastAsia="Times New Roman" w:hAnsi="Times New Roman" w:cs="Times New Roman"/>
-        </w:rPr>
-        <w:lastRenderedPageBreak/>
-        <w:t xml:space="preserve">community structure in infants </w:t>
+        <w:t xml:space="preserve">. Especially gastrointestinal parasites, which have been linked to microbial dysbiosis and shifts in community structure in infants </w:t>
       </w:r>
       <w:hyperlink r:id="rId64">
         <w:r>
@@ -3220,6 +3240,7 @@
           <w:bCs/>
           <w:color w:val="000000"/>
         </w:rPr>
+        <w:lastRenderedPageBreak/>
         <w:t>Conclusion</w:t>
       </w:r>
       <w:r>
@@ -3250,12 +3271,14 @@
         </w:rPr>
         <w:t xml:space="preserve"> anemic infants. Diversity metrics, indicator species, and differential abundance </w:t>
       </w:r>
-      <w:r>
-        <w:rPr>
-          <w:rFonts w:ascii="Times New Roman" w:eastAsia="Times New Roman" w:hAnsi="Times New Roman" w:cs="Times New Roman"/>
-        </w:rPr>
-        <w:t>were</w:t>
-      </w:r>
+      <w:proofErr w:type="gramStart"/>
+      <w:r>
+        <w:rPr>
+          <w:rFonts w:ascii="Times New Roman" w:eastAsia="Times New Roman" w:hAnsi="Times New Roman" w:cs="Times New Roman"/>
+        </w:rPr>
+        <w:t>was</w:t>
+      </w:r>
+      <w:proofErr w:type="gramEnd"/>
       <w:r>
         <w:rPr>
           <w:rFonts w:ascii="Times New Roman" w:eastAsia="Times New Roman" w:hAnsi="Times New Roman" w:cs="Times New Roman"/>
@@ -3273,14 +3296,7 @@
         <w:rPr>
           <w:rFonts w:ascii="Times New Roman" w:eastAsia="Times New Roman" w:hAnsi="Times New Roman" w:cs="Times New Roman"/>
         </w:rPr>
-        <w:t xml:space="preserve">, and no supplement. Additionally, functional </w:t>
-      </w:r>
-      <w:r>
-        <w:rPr>
-          <w:rFonts w:ascii="Times New Roman" w:eastAsia="Times New Roman" w:hAnsi="Times New Roman" w:cs="Times New Roman"/>
-        </w:rPr>
-        <w:lastRenderedPageBreak/>
-        <w:t xml:space="preserve">analysis aimed to reveal potential shifts in the metabolic capabilities of the gut microbiome when taking these supplements. We found that there are no notable shifts in each of these key descriptors of the gut microbiome when comparing different supplements, suggesting that iron supplementation has no substantial effect on the gut microbiome of these infants. Furthermore, through linear regression model analyses, microbiome diversity was found to be positively correlated with both hemoglobin and ferritin levels. Changing supplementation type resulted in no significant correlations for microbial diversity and iron biomarkers when compared to non-supplemented infants. These results each disprove our hypothesis that iron supplementation would lead to measurable differences in both composition and function of the gut microbiome of </w:t>
+        <w:t xml:space="preserve">, and no supplement. Additionally, functional analysis aimed to reveal potential shifts in the metabolic capabilities of the gut microbiome when taking these supplements. We found that there are no notable shifts in each of these key descriptors of the gut microbiome when comparing different supplements, suggesting that iron supplementation has no substantial effect on the gut microbiome of these infants. Furthermore, through linear regression model analyses, microbiome diversity was found to be positively correlated with both hemoglobin and ferritin levels. Changing supplementation type resulted in no significant correlations for microbial diversity and iron biomarkers when compared to non-supplemented infants. These results each disprove our hypothesis that iron supplementation would lead to measurable differences in both composition and function of the gut microbiome of </w:t>
       </w:r>
       <w:proofErr w:type="gramStart"/>
       <w:r>
@@ -3391,7 +3407,14 @@
         <w:rPr>
           <w:rFonts w:ascii="Times New Roman" w:eastAsia="Times New Roman" w:hAnsi="Times New Roman" w:cs="Times New Roman"/>
         </w:rPr>
-        <w:t xml:space="preserve"> and metaproteomic analyses would provide information on gene expression and protein-level activity, enabling a more direct assessment of microbial function and its potential relationship with host physiology. These approaches would help determine whether subtle compositional differences correspond to functional changes within the microbiome. </w:t>
+        <w:t xml:space="preserve"> and metaproteomic analyses would provide information on gene expression and protein-level activity, enabling a more direct assessment of microbial function and its potential relationship with host </w:t>
+      </w:r>
+      <w:r>
+        <w:rPr>
+          <w:rFonts w:ascii="Times New Roman" w:eastAsia="Times New Roman" w:hAnsi="Times New Roman" w:cs="Times New Roman"/>
+        </w:rPr>
+        <w:lastRenderedPageBreak/>
+        <w:t xml:space="preserve">physiology. These approaches would help determine whether subtle compositional differences correspond to functional changes within the microbiome. </w:t>
       </w:r>
     </w:p>
     <w:p>
@@ -3406,14 +3429,7 @@
         <w:rPr>
           <w:rFonts w:ascii="Times New Roman" w:eastAsia="Times New Roman" w:hAnsi="Times New Roman" w:cs="Times New Roman"/>
         </w:rPr>
-        <w:t xml:space="preserve">Further investigation into supplementation-specific effects may also provide greater resolution. Supplementation groups were broadly categorized within this study, however, differences in dosage, iron formulation and duration of supplementation may influence microbiome outcomes in distinct ways, </w:t>
-      </w:r>
-      <w:r>
-        <w:rPr>
-          <w:rFonts w:ascii="Times New Roman" w:eastAsia="Times New Roman" w:hAnsi="Times New Roman" w:cs="Times New Roman"/>
-        </w:rPr>
-        <w:lastRenderedPageBreak/>
-        <w:t xml:space="preserve">especially as the gut microbiome is known to be highly variable during infancy </w:t>
+        <w:t xml:space="preserve">Further investigation into supplementation-specific effects may also provide greater resolution. Supplementation groups were broadly categorized within this study, however, differences in dosage, iron formulation and duration of supplementation may influence microbiome outcomes in distinct ways, especially as the gut microbiome is known to be highly variable during infancy </w:t>
       </w:r>
       <w:hyperlink r:id="rId69">
         <w:r>
@@ -3536,14 +3552,6 @@
     </w:p>
     <w:p>
       <w:pPr>
-        <w:spacing w:line="480" w:lineRule="auto"/>
-        <w:rPr>
-          <w:rFonts w:ascii="Times New Roman" w:eastAsia="Times New Roman" w:hAnsi="Times New Roman" w:cs="Times New Roman"/>
-        </w:rPr>
-      </w:pPr>
-    </w:p>
-    <w:p>
-      <w:pPr>
         <w:pStyle w:val="Heading3"/>
         <w:spacing w:line="480" w:lineRule="auto"/>
         <w:rPr>
@@ -3615,7 +3623,21 @@
         <w:rPr>
           <w:rFonts w:ascii="Times New Roman" w:eastAsia="Times New Roman" w:hAnsi="Times New Roman" w:cs="Times New Roman"/>
         </w:rPr>
-        <w:t>Artificial intelligence (AI) was not used in the analysis or writing of our study.</w:t>
+        <w:t xml:space="preserve">Artificial Intelligence (AI) tools were used in a limited and supportive capacity during this project. Specifically, AI was used to assist with troubleshooting code </w:t>
+      </w:r>
+      <w:proofErr w:type="gramStart"/>
+      <w:r>
+        <w:rPr>
+          <w:rFonts w:ascii="Times New Roman" w:eastAsia="Times New Roman" w:hAnsi="Times New Roman" w:cs="Times New Roman"/>
+        </w:rPr>
+        <w:t>errors, and</w:t>
+      </w:r>
+      <w:proofErr w:type="gramEnd"/>
+      <w:r>
+        <w:rPr>
+          <w:rFonts w:ascii="Times New Roman" w:eastAsia="Times New Roman" w:hAnsi="Times New Roman" w:cs="Times New Roman"/>
+        </w:rPr>
+        <w:t xml:space="preserve"> clarifying course concepts. AI was also used for minor editing purposes, including grammar correction, sentence rephrasing, and improving clarity of written text. All outputs generated by AI were carefully reviewed and validated by the authors. AI was not used to design analyses, generate novel analytical approaches, or implement methods beyond those covered in course materials or instructed workflows.</w:t>
       </w:r>
     </w:p>
     <w:p>
@@ -3685,6 +3707,7 @@
           <w:bCs/>
           <w:color w:val="000000"/>
         </w:rPr>
+        <w:lastRenderedPageBreak/>
         <w:t xml:space="preserve">References </w:t>
       </w:r>
     </w:p>
@@ -5413,7 +5436,6 @@
             <w:b/>
             <w:bCs/>
           </w:rPr>
-          <w:lastRenderedPageBreak/>
           <w:t>Estaki</w:t>
         </w:r>
         <w:proofErr w:type="spellEnd"/>
@@ -6007,16 +6029,7 @@
             <w:b/>
             <w:bCs/>
           </w:rPr>
-          <w:t xml:space="preserve"> B, Hannigan G, Hill MO, Lahti L, Martino C, McGlinn D, </w:t>
-        </w:r>
-        <w:r>
-          <w:rPr>
-            <w:rFonts w:ascii="Times New Roman" w:eastAsia="Times New Roman" w:hAnsi="Times New Roman" w:cs="Times New Roman"/>
-            <w:b/>
-            <w:bCs/>
-          </w:rPr>
-          <w:lastRenderedPageBreak/>
-          <w:t>Ouellette M-H, Ribeiro Cunha E, Smith T, Stier A, Ter Braak CJF, Weedon J</w:t>
+          <w:t xml:space="preserve"> B, Hannigan G, Hill MO, Lahti L, Martino C, McGlinn D, Ouellette M-H, Ribeiro Cunha E, Smith T, Stier A, Ter Braak CJF, Weedon J</w:t>
         </w:r>
       </w:hyperlink>
       <w:hyperlink r:id="rId196">
@@ -8499,7 +8512,7 @@
         <w:spacing w:after="240" w:line="480" w:lineRule="auto"/>
         <w:ind w:left="504"/>
         <w:rPr>
-          <w:rFonts w:ascii="Times New Roman" w:hAnsi="Times New Roman" w:cs="Times New Roman"/>
+          <w:rFonts w:ascii="Times New Roman" w:eastAsia="Times New Roman" w:hAnsi="Times New Roman" w:cs="Times New Roman"/>
         </w:rPr>
       </w:pPr>
       <w:hyperlink r:id="rId361">
@@ -8583,7 +8596,98 @@
     </w:p>
     <w:p>
       <w:pPr>
-        <w:spacing w:line="480" w:lineRule="auto"/>
+        <w:spacing w:after="240" w:line="480" w:lineRule="auto"/>
+        <w:ind w:left="504"/>
+        <w:rPr>
+          <w:rFonts w:ascii="Times New Roman" w:eastAsia="Times New Roman" w:hAnsi="Times New Roman" w:cs="Times New Roman"/>
+        </w:rPr>
+      </w:pPr>
+    </w:p>
+    <w:p>
+      <w:pPr>
+        <w:spacing w:after="240" w:line="480" w:lineRule="auto"/>
+        <w:ind w:left="504"/>
+        <w:rPr>
+          <w:rFonts w:ascii="Times New Roman" w:eastAsia="Times New Roman" w:hAnsi="Times New Roman" w:cs="Times New Roman"/>
+        </w:rPr>
+      </w:pPr>
+    </w:p>
+    <w:p>
+      <w:pPr>
+        <w:spacing w:after="240" w:line="480" w:lineRule="auto"/>
+        <w:ind w:left="504"/>
+        <w:rPr>
+          <w:rFonts w:ascii="Times New Roman" w:eastAsia="Times New Roman" w:hAnsi="Times New Roman" w:cs="Times New Roman"/>
+        </w:rPr>
+      </w:pPr>
+    </w:p>
+    <w:p>
+      <w:pPr>
+        <w:spacing w:after="240" w:line="480" w:lineRule="auto"/>
+        <w:ind w:left="504"/>
+        <w:rPr>
+          <w:rFonts w:ascii="Times New Roman" w:eastAsia="Times New Roman" w:hAnsi="Times New Roman" w:cs="Times New Roman"/>
+        </w:rPr>
+      </w:pPr>
+    </w:p>
+    <w:p>
+      <w:pPr>
+        <w:spacing w:after="240" w:line="480" w:lineRule="auto"/>
+        <w:ind w:left="504"/>
+        <w:rPr>
+          <w:rFonts w:ascii="Times New Roman" w:eastAsia="Times New Roman" w:hAnsi="Times New Roman" w:cs="Times New Roman"/>
+        </w:rPr>
+      </w:pPr>
+    </w:p>
+    <w:p>
+      <w:pPr>
+        <w:spacing w:after="240" w:line="480" w:lineRule="auto"/>
+        <w:ind w:left="504"/>
+        <w:rPr>
+          <w:rFonts w:ascii="Times New Roman" w:eastAsia="Times New Roman" w:hAnsi="Times New Roman" w:cs="Times New Roman"/>
+        </w:rPr>
+      </w:pPr>
+    </w:p>
+    <w:p>
+      <w:pPr>
+        <w:spacing w:after="240" w:line="480" w:lineRule="auto"/>
+        <w:ind w:left="504"/>
+        <w:rPr>
+          <w:rFonts w:ascii="Times New Roman" w:eastAsia="Times New Roman" w:hAnsi="Times New Roman" w:cs="Times New Roman"/>
+        </w:rPr>
+      </w:pPr>
+    </w:p>
+    <w:p>
+      <w:pPr>
+        <w:spacing w:after="240" w:line="480" w:lineRule="auto"/>
+        <w:ind w:left="504"/>
+        <w:rPr>
+          <w:rFonts w:ascii="Times New Roman" w:eastAsia="Times New Roman" w:hAnsi="Times New Roman" w:cs="Times New Roman"/>
+        </w:rPr>
+      </w:pPr>
+    </w:p>
+    <w:p>
+      <w:pPr>
+        <w:spacing w:after="240" w:line="480" w:lineRule="auto"/>
+        <w:ind w:left="504"/>
+        <w:rPr>
+          <w:rFonts w:ascii="Times New Roman" w:eastAsia="Times New Roman" w:hAnsi="Times New Roman" w:cs="Times New Roman"/>
+        </w:rPr>
+      </w:pPr>
+    </w:p>
+    <w:p>
+      <w:pPr>
+        <w:spacing w:after="240" w:line="480" w:lineRule="auto"/>
+        <w:ind w:left="504"/>
+        <w:rPr>
+          <w:rFonts w:ascii="Times New Roman" w:eastAsia="Times New Roman" w:hAnsi="Times New Roman" w:cs="Times New Roman"/>
+        </w:rPr>
+      </w:pPr>
+    </w:p>
+    <w:p>
+      <w:pPr>
+        <w:spacing w:after="240" w:line="480" w:lineRule="auto"/>
+        <w:ind w:left="504"/>
         <w:rPr>
           <w:rFonts w:ascii="Times New Roman" w:eastAsia="Times New Roman" w:hAnsi="Times New Roman" w:cs="Times New Roman"/>
         </w:rPr>
@@ -8623,16 +8727,16 @@
           <w:noProof/>
         </w:rPr>
         <w:drawing>
-          <wp:inline distT="114300" distB="114300" distL="114300" distR="114300" wp14:anchorId="5D7759E8" wp14:editId="46C10F98">
+          <wp:inline distT="114300" distB="114300" distL="114300" distR="114300" wp14:anchorId="1283CE07" wp14:editId="65838BC0">
             <wp:extent cx="5933588" cy="2183482"/>
             <wp:effectExtent l="0" t="0" r="0" b="0"/>
-            <wp:docPr id="2" name="image4.png"/>
+            <wp:docPr id="2" name="image2.png"/>
             <wp:cNvGraphicFramePr/>
             <a:graphic xmlns:a="http://schemas.openxmlformats.org/drawingml/2006/main">
               <a:graphicData uri="http://schemas.openxmlformats.org/drawingml/2006/picture">
                 <pic:pic xmlns:pic="http://schemas.openxmlformats.org/drawingml/2006/picture">
                   <pic:nvPicPr>
-                    <pic:cNvPr id="0" name="image4.png"/>
+                    <pic:cNvPr id="0" name="image2.png"/>
                     <pic:cNvPicPr preferRelativeResize="0"/>
                   </pic:nvPicPr>
                   <pic:blipFill>
@@ -8797,16 +8901,16 @@
           <w:noProof/>
         </w:rPr>
         <w:drawing>
-          <wp:inline distT="114300" distB="114300" distL="114300" distR="114300" wp14:anchorId="77800CC9" wp14:editId="067781AB">
+          <wp:inline distT="114300" distB="114300" distL="114300" distR="114300" wp14:anchorId="02954136" wp14:editId="32F35CC8">
             <wp:extent cx="5943600" cy="2021607"/>
             <wp:effectExtent l="0" t="0" r="0" b="0"/>
-            <wp:docPr id="5" name="image2.jpg"/>
+            <wp:docPr id="5" name="image3.jpg"/>
             <wp:cNvGraphicFramePr/>
             <a:graphic xmlns:a="http://schemas.openxmlformats.org/drawingml/2006/main">
               <a:graphicData uri="http://schemas.openxmlformats.org/drawingml/2006/picture">
                 <pic:pic xmlns:pic="http://schemas.openxmlformats.org/drawingml/2006/picture">
                   <pic:nvPicPr>
-                    <pic:cNvPr id="0" name="image2.jpg"/>
+                    <pic:cNvPr id="0" name="image3.jpg"/>
                     <pic:cNvPicPr preferRelativeResize="0"/>
                   </pic:nvPicPr>
                   <pic:blipFill>
@@ -8953,7 +9057,7 @@
         </w:rPr>
         <w:lastRenderedPageBreak/>
         <w:drawing>
-          <wp:inline distT="114300" distB="114300" distL="114300" distR="114300" wp14:anchorId="31B64055" wp14:editId="37CED419">
+          <wp:inline distT="114300" distB="114300" distL="114300" distR="114300" wp14:anchorId="3D3B25EC" wp14:editId="212AA13C">
             <wp:extent cx="5851629" cy="2176463"/>
             <wp:effectExtent l="0" t="0" r="0" b="0"/>
             <wp:docPr id="1" name="image1.png"/>
@@ -9102,16 +9206,16 @@
           <w:noProof/>
         </w:rPr>
         <w:drawing>
-          <wp:inline distT="114300" distB="114300" distL="114300" distR="114300" wp14:anchorId="14AB870C" wp14:editId="1368812C">
+          <wp:inline distT="114300" distB="114300" distL="114300" distR="114300" wp14:anchorId="7B782DBF" wp14:editId="4C7FE602">
             <wp:extent cx="5943600" cy="2108200"/>
             <wp:effectExtent l="0" t="0" r="0" b="0"/>
-            <wp:docPr id="3" name="image3.png"/>
+            <wp:docPr id="3" name="image5.png"/>
             <wp:cNvGraphicFramePr/>
             <a:graphic xmlns:a="http://schemas.openxmlformats.org/drawingml/2006/main">
               <a:graphicData uri="http://schemas.openxmlformats.org/drawingml/2006/picture">
                 <pic:pic xmlns:pic="http://schemas.openxmlformats.org/drawingml/2006/picture">
                   <pic:nvPicPr>
-                    <pic:cNvPr id="0" name="image3.png"/>
+                    <pic:cNvPr id="0" name="image5.png"/>
                     <pic:cNvPicPr preferRelativeResize="0"/>
                   </pic:nvPicPr>
                   <pic:blipFill>
@@ -9227,16 +9331,16 @@
         </w:rPr>
         <w:lastRenderedPageBreak/>
         <w:drawing>
-          <wp:inline distT="114300" distB="114300" distL="114300" distR="114300" wp14:anchorId="2B303619" wp14:editId="73983100">
+          <wp:inline distT="114300" distB="114300" distL="114300" distR="114300" wp14:anchorId="61A7AAAC" wp14:editId="784B816A">
             <wp:extent cx="5943600" cy="1701800"/>
             <wp:effectExtent l="0" t="0" r="0" b="0"/>
-            <wp:docPr id="4" name="image5.png"/>
+            <wp:docPr id="4" name="image4.png"/>
             <wp:cNvGraphicFramePr/>
             <a:graphic xmlns:a="http://schemas.openxmlformats.org/drawingml/2006/main">
               <a:graphicData uri="http://schemas.openxmlformats.org/drawingml/2006/picture">
                 <pic:pic xmlns:pic="http://schemas.openxmlformats.org/drawingml/2006/picture">
                   <pic:nvPicPr>
-                    <pic:cNvPr id="0" name="image5.png"/>
+                    <pic:cNvPr id="0" name="image4.png"/>
                     <pic:cNvPicPr preferRelativeResize="0"/>
                   </pic:nvPicPr>
                   <pic:blipFill>
@@ -9265,7 +9369,6 @@
     </w:p>
     <w:p>
       <w:pPr>
-        <w:pStyle w:val="Heading3"/>
         <w:spacing w:line="480" w:lineRule="auto"/>
         <w:rPr>
           <w:rFonts w:ascii="Times New Roman" w:eastAsia="Times New Roman" w:hAnsi="Times New Roman" w:cs="Times New Roman"/>
@@ -9273,8 +9376,16 @@
           <w:szCs w:val="18"/>
         </w:rPr>
       </w:pPr>
-      <w:bookmarkStart w:id="12" w:name="_bv7qjxawk1sv" w:colFirst="0" w:colLast="0"/>
-      <w:bookmarkEnd w:id="12"/>
+      <w:r>
+        <w:rPr>
+          <w:rFonts w:ascii="Times New Roman" w:eastAsia="Times New Roman" w:hAnsi="Times New Roman" w:cs="Times New Roman"/>
+          <w:b/>
+          <w:bCs/>
+          <w:sz w:val="18"/>
+          <w:szCs w:val="18"/>
+        </w:rPr>
+        <w:t>Figure 5. Linear model tests found no significant correlation between microbial diversity and iron markers between supplementation types when compared to non-supplemented infants.</w:t>
+      </w:r>
       <w:r>
         <w:rPr>
           <w:rFonts w:ascii="Times New Roman" w:eastAsia="Times New Roman" w:hAnsi="Times New Roman" w:cs="Times New Roman"/>
@@ -9284,7 +9395,7 @@
           <w:sz w:val="18"/>
           <w:szCs w:val="18"/>
         </w:rPr>
-        <w:t xml:space="preserve">Figure 5. Linear model tests found no significant correlation between microbial diversity and iron markers between supplementation types when compared to non-supplemented infants. </w:t>
+        <w:t xml:space="preserve"> </w:t>
       </w:r>
       <w:r>
         <w:rPr>

</xml_diff>